<commit_message>
Update demo communication result figure
</commit_message>
<xml_diff>
--- a/output/doc/chinese_truth.docx
+++ b/output/doc/chinese_truth.docx
@@ -897,7 +897,7 @@
     </w:p>
     <w:p>
       <w:r>
-        <w:t>这个结果有两个实际含义。第一，任务拆分是真正发生的，而不是把“多 agent”藏在一个 prompt 里。第二，最终对外结果仍然能收束成一个前台可负责的结论，用户不需要自己拼接十几个角色的原始输出。下图展示的是该 demo 的 room 视图，它把 agent 数、消息数、投递数和代表性通信链直接放在同一个界面中，便于演示和检查。</w:t>
+        <w:t>这个结果有两个实际含义。第一，任务拆分是真正发生的，而不是把“多 agent”藏在一个 prompt 里。第二，最终对外结果仍然能收束成一个前台可负责的结论，用户不需要自己拼接十几个角色的原始输出。下图基于真实 demo 前端截图和 room artifact 重绘，把主责任链放在左侧，把六部通信按自上而下顺序排列在右侧，更适合在报告里直接展示“谁负责、谁回信、最后如何收束”。</w:t>
       </w:r>
     </w:p>
     <w:p>
@@ -907,7 +907,7 @@
       <w:r>
         <w:drawing>
           <wp:inline xmlns:a="http://schemas.openxmlformats.org/drawingml/2006/main" xmlns:pic="http://schemas.openxmlformats.org/drawingml/2006/picture">
-            <wp:extent cx="5940000" cy="3564000"/>
+            <wp:extent cx="5940000" cy="4529250"/>
             <wp:docPr id="2" name="Picture 2"/>
             <wp:cNvGraphicFramePr>
               <a:graphicFrameLocks noChangeAspect="1"/>
@@ -916,7 +916,7 @@
               <a:graphicData uri="http://schemas.openxmlformats.org/drawingml/2006/picture">
                 <pic:pic>
                   <pic:nvPicPr>
-                    <pic:cNvPr id="0" name="three-provinces-room-view-daylight.png"/>
+                    <pic:cNvPr id="0" name="results-three-provinces-communication.png"/>
                     <pic:cNvPicPr/>
                   </pic:nvPicPr>
                   <pic:blipFill>
@@ -928,7 +928,7 @@
                   <pic:spPr>
                     <a:xfrm>
                       <a:off x="0" y="0"/>
-                      <a:ext cx="5940000" cy="3564000"/>
+                      <a:ext cx="5940000" cy="4529250"/>
                     </a:xfrm>
                     <a:prstGeom prst="rect"/>
                   </pic:spPr>
@@ -944,7 +944,7 @@
         <w:jc w:val="center"/>
       </w:pPr>
       <w:r>
-        <w:t>图 2 三省六部 demo 的 room 视图：room 最终为 done，11 个智能体通过 21 条 virtual mail 和 22 次投递完成一次可回放的协作链。</w:t>
+        <w:t>图 2 三省六部 demo 的部门通信图：左侧是太子、中书省、门下省、尚书省到最终覆核的主责任链，右侧按自上而下顺序展示尚书省与六部之间的实际通信。</w:t>
       </w:r>
     </w:p>
     <w:p>

</xml_diff>